<commit_message>
mongodb added as mirror of postgres
</commit_message>
<xml_diff>
--- a/sprawozdanie.docx
+++ b/sprawozdanie.docx
@@ -1054,7 +1054,7 @@
         <w:rPr>
           <w:lang w:val="pl-PL"/>
         </w:rPr>
-        <w:t xml:space="preserve"> SHA-256.</w:t>
+        <w:t xml:space="preserve"> SHA-256. Pole is_admin (domyślnie FALSE) pozwala nadać uprawnienia administratora.</w:t>
       </w:r>
     </w:p>
     <w:p>
@@ -3263,14 +3263,14 @@
         <w:rPr>
           <w:lang w:val="pl-PL"/>
         </w:rPr>
-        <w:t>Admin</w:t>
+        <w:t>Admin — panel wpisywania wyników meczów z automatycznym przeliczeniem punktów (widoczny wyłącznie dla konta administratora).</w:t>
       </w:r>
       <w:proofErr w:type="gramEnd"/>
       <w:r>
         <w:rPr>
           <w:lang w:val="pl-PL"/>
         </w:rPr>
-        <w:t xml:space="preserve"> — panel wpisywania wyników meczów z automatycznym przeliczeniem punktów.</w:t>
+        <w:t>Admin — panel wpisywania wyników meczów z automatycznym przeliczeniem punktów (widoczny wyłącznie dla konta administratora).</w:t>
       </w:r>
     </w:p>
     <w:p>
@@ -4078,7 +4078,7 @@
         <w:rPr>
           <w:lang w:val="pl-PL"/>
         </w:rPr>
-        <w:t>Zmiany schematu bazy danych wersjonowane są przez kolejne pliki SQL. Wcześniejsze pliki nigdy nie są modyfikowane — każda zmiana to nowy plik.</w:t>
+        <w:t>Schemat bazy danych przechowywany jest w dwóch plikach SQL: 001_init.sql zawiera definicje wszystkich tabel, 002_seed.sql wypełnia bazę danymi testowymi. Do resetowania bazy służy skrypt db/reset_db.sh, który zatrzymuje kontener Docker, usuwa dane (docker compose down -v), uruchamia go ponownie i wykonuje oba pliki migracji.</w:t>
       </w:r>
     </w:p>
     <w:tbl>
@@ -4304,31 +4304,34 @@
         <w:pStyle w:val="Normal"/>
       </w:pPr>
       <w:r>
-        <w:t xml:space="preserve">Ze względu na klucze obce tabele muszą być tworzone w określonej kolejności: users, leagues, scoring_rules, następnie teams, matches, a na końcu predictions. Każdą instrukcję CREATE TABLE należy wykonać osobno w edytorze SQL Accessa (Create → Query Design → SQL View → Run).</w:t>
+        <w:t xml:space="preserve">Ze względu na klucze obce, tabele muszą być tworzone w kolejności: users, leagues, scoring_rules, następnie teams, matches, a na końcu predictions. Każdą instrukcję CREATE TABLE należy wykonać osobno w edytorze SQL Accessa (Create → Query Design → SQL View → Run).</w:t>
       </w:r>
     </w:p>
     <w:p>
       <w:pPr>
-        <w:pStyle w:val="Heading2"/>
-      </w:pPr>
-      <w:r>
-        <w:t xml:space="preserve">10.1. Kolejność tworzenia tabel</w:t>
+        <w:pStyle w:val="Heading1"/>
+      </w:pPr>
+      <w:r>
+        <w:rPr>
+          <w:color w:val="1A1A2E"/>
+        </w:rPr>
+        <w:t xml:space="preserve">10. Odwzorowanie schematu w Microsoft Access</w:t>
       </w:r>
     </w:p>
     <w:p>
       <w:pPr>
-        <w:pStyle w:val="ListBullet"/>
-      </w:pPr>
-      <w:r>
-        <w:t xml:space="preserve">Ograniczenia CHECK (np. status IN ('scheduled', 'finished')) nie są wspierane w SQL Access — ustawiane ręcznie przez właściwość Validation Rule w widoku projektu tabeli.</w:t>
+        <w:pStyle w:val="Normal"/>
+      </w:pPr>
+      <w:r>
+        <w:t xml:space="preserve">Schemat bazy danych został odwzorowany w Microsoft Access jako niezależna kopia struktury. Plik db/access_schema.sql zawiera definicje wszystkich 6 tabel w dialekcie Jet SQL (Access SQL). Tabele odwzorowują ten sam schemat co baza PostgreSQL — różnią się wyłącznie składnią.</w:t>
       </w:r>
     </w:p>
     <w:p>
       <w:pPr>
-        <w:pStyle w:val="ListBullet"/>
-      </w:pPr>
-      <w:r>
-        <w:t xml:space="preserve">DEFAULT NOW() → DEFAULT Now()</w:t>
+        <w:pStyle w:val="Normal"/>
+      </w:pPr>
+      <w:r>
+        <w:t xml:space="preserve">Kluczowe różnice między dialektem PostgreSQL a Access SQL:</w:t>
       </w:r>
     </w:p>
     <w:p>
@@ -4336,7 +4339,7 @@
         <w:pStyle w:val="ListBullet"/>
       </w:pPr>
       <w:r>
-        <w:t xml:space="preserve">TIMESTAMPTZ → DATETIME</w:t>
+        <w:t xml:space="preserve">SERIAL → COUNTER (automatyczny licznik klucza głównego)</w:t>
       </w:r>
     </w:p>
     <w:p>
@@ -4344,7 +4347,7 @@
         <w:pStyle w:val="ListBullet"/>
       </w:pPr>
       <w:r>
-        <w:t xml:space="preserve">SMALLINT → SHORT</w:t>
+        <w:t xml:space="preserve">VARCHAR(n) → TEXT(n)</w:t>
       </w:r>
     </w:p>
     <w:p>
@@ -4352,7 +4355,7 @@
         <w:pStyle w:val="ListBullet"/>
       </w:pPr>
       <w:r>
-        <w:t xml:space="preserve">VARCHAR(n) → TEXT(n)</w:t>
+        <w:t xml:space="preserve">SMALLINT → SHORT</w:t>
       </w:r>
     </w:p>
     <w:p>
@@ -4360,31 +4363,42 @@
         <w:pStyle w:val="ListBullet"/>
       </w:pPr>
       <w:r>
-        <w:t xml:space="preserve">SERIAL → COUNTER (automatyczny licznik klucza głównego)</w:t>
+        <w:t xml:space="preserve">TIMESTAMPTZ → DATETIME</w:t>
       </w:r>
     </w:p>
     <w:p>
       <w:pPr>
-        <w:pStyle w:val="Normal"/>
-      </w:pPr>
-      <w:r>
-        <w:t xml:space="preserve">Kluczowe różnice między dialektem PostgreSQL a Access SQL:</w:t>
+        <w:pStyle w:val="ListBullet"/>
+      </w:pPr>
+      <w:r>
+        <w:t xml:space="preserve">DEFAULT NOW() → DEFAULT Now()</w:t>
       </w:r>
     </w:p>
     <w:p>
       <w:pPr>
-        <w:pStyle w:val="Normal"/>
-      </w:pPr>
-      <w:r>
-        <w:t xml:space="preserve">Schemat bazy danych został odwzorowany w Microsoft Access jako niezależna kopia struktury. Plik db/access_schema.sql zawiera definicje wszystkich 6 tabel w dialekcie Jet SQL (Access SQL). Tabele odwzorowują ten sam schemat co baza PostgreSQL — różnią się wyłącznie składnią.</w:t>
+        <w:pStyle w:val="ListBullet"/>
+      </w:pPr>
+      <w:r>
+        <w:t xml:space="preserve">Ograniczenia CHECK (np. status IN ('scheduled', 'finished')) nie są wspierane w SQL Access — ustawiane ręcznie przez właściwość Validation Rule w widoku projektu tabeli.</w:t>
       </w:r>
     </w:p>
     <w:p>
       <w:pPr>
-        <w:pStyle w:val="Heading1"/>
-      </w:pPr>
-      <w:r>
-        <w:t xml:space="preserve">10. Odwzorowanie schematu w Microsoft Access</w:t>
+        <w:pStyle w:val="Heading2"/>
+      </w:pPr>
+      <w:r>
+        <w:rPr>
+          <w:color w:val="E94560"/>
+        </w:rPr>
+        <w:t xml:space="preserve">10.1. Kolejność tworzenia tabel</w:t>
+      </w:r>
+    </w:p>
+    <w:p>
+      <w:pPr>
+        <w:pStyle w:val="Normal"/>
+      </w:pPr>
+      <w:r>
+        <w:t xml:space="preserve">Ze względu na klucze obce, tabele muszą być tworzone w kolejności: users, leagues, scoring_rules, następnie teams, matches, a na końcu predictions. Każdą instrukcję CREATE TABLE należy wykonać osobno w edytorze SQL Accessa (Create → Query Design → SQL View → Run).</w:t>
       </w:r>
     </w:p>
     <w:p>

</xml_diff>

<commit_message>
panel admina dodawanie meczow
</commit_message>
<xml_diff>
--- a/sprawozdanie.docx
+++ b/sprawozdanie.docx
@@ -4301,29 +4301,32 @@
     </w:p>
     <w:p>
       <w:pPr>
-        <w:pStyle w:val="Normal"/>
-      </w:pPr>
-      <w:r>
-        <w:t xml:space="preserve">Ze względu na klucze obce, tabele muszą być tworzone w kolejności: users, leagues, scoring_rules, następnie teams, matches, a na końcu predictions. Każdą instrukcję CREATE TABLE należy wykonać osobno w edytorze SQL Accessa (Create → Query Design → SQL View → Run).</w:t>
+        <w:pStyle w:val="Heading1"/>
+      </w:pPr>
+      <w:r>
+        <w:rPr>
+          <w:color w:val="1A1A2E"/>
+        </w:rPr>
+        <w:t xml:space="preserve">10. Odwzorowanie schematu w MongoDB</w:t>
       </w:r>
     </w:p>
     <w:p>
       <w:pPr>
-        <w:pStyle w:val="Heading1"/>
-      </w:pPr>
-      <w:r>
-        <w:rPr>
-          <w:color w:val="1A1A2E"/>
-        </w:rPr>
-        <w:t xml:space="preserve">10. Odwzorowanie schematu w Microsoft Access</w:t>
+        <w:pStyle w:val="Normal"/>
+      </w:pPr>
+      <w:r>
+        <w:t xml:space="preserve">Zgodnie z informacjami dodatkowymi do zadania, baza Access może być zastąpiona przez MongoDB. MongoDB to nierelacyjna baza danych dokumentowa — dane przechowywane są jako dokumenty JSON w kolekcjach zamiast wierszy w tabelach. Schemat jest elastyczny i nie wymaga z góry zdefiniowanych kolumn.</w:t>
       </w:r>
     </w:p>
     <w:p>
       <w:pPr>
-        <w:pStyle w:val="Normal"/>
-      </w:pPr>
-      <w:r>
-        <w:t xml:space="preserve">Schemat bazy danych został odwzorowany w Microsoft Access jako niezależna kopia struktury. Plik db/access_schema.sql zawiera definicje wszystkich 6 tabel w dialekcie Jet SQL (Access SQL). Tabele odwzorowują ten sam schemat co baza PostgreSQL — różnią się wyłącznie składnią.</w:t>
+        <w:pStyle w:val="Heading2"/>
+      </w:pPr>
+      <w:r>
+        <w:rPr>
+          <w:color w:val="E94560"/>
+        </w:rPr>
+        <w:t xml:space="preserve">10.1. Porównanie PostgreSQL i MongoDB</w:t>
       </w:r>
     </w:p>
     <w:p>
@@ -4331,7 +4334,7 @@
         <w:pStyle w:val="Normal"/>
       </w:pPr>
       <w:r>
-        <w:t xml:space="preserve">Kluczowe różnice między dialektem PostgreSQL a Access SQL:</w:t>
+        <w:t xml:space="preserve">Oba systemy przechowują te same dane projektu, ale w różny sposób:</w:t>
       </w:r>
     </w:p>
     <w:p>
@@ -4339,7 +4342,7 @@
         <w:pStyle w:val="ListBullet"/>
       </w:pPr>
       <w:r>
-        <w:t xml:space="preserve">SERIAL → COUNTER (automatyczny licznik klucza głównego)</w:t>
+        <w:t xml:space="preserve">Struktura: PostgreSQL = tabele + wiersze o stałym schemacie; MongoDB = kolekcje + dokumenty JSON o elastycznej strukturze.</w:t>
       </w:r>
     </w:p>
     <w:p>
@@ -4347,7 +4350,7 @@
         <w:pStyle w:val="ListBullet"/>
       </w:pPr>
       <w:r>
-        <w:t xml:space="preserve">VARCHAR(n) → TEXT(n)</w:t>
+        <w:t xml:space="preserve">Relacje: PostgreSQL używa kluczy obcych i operacji JOIN; MongoDB osadza powiązane dane bezpośrednio w dokumencie (embedding) lub trzyma referencje id.</w:t>
       </w:r>
     </w:p>
     <w:p>
@@ -4355,7 +4358,7 @@
         <w:pStyle w:val="ListBullet"/>
       </w:pPr>
       <w:r>
-        <w:t xml:space="preserve">SMALLINT → SHORT</w:t>
+        <w:t xml:space="preserve">Przykład: w PostgreSQL mecz przechowuje home_team_id = 7 i wymaga JOIN z tabelą teams. W MongoDB dokument meczu zawiera od razu "home_team": "Bayern München" — bez JOINa.</w:t>
       </w:r>
     </w:p>
     <w:p>
@@ -4363,7 +4366,7 @@
         <w:pStyle w:val="ListBullet"/>
       </w:pPr>
       <w:r>
-        <w:t xml:space="preserve">TIMESTAMPTZ → DATETIME</w:t>
+        <w:t xml:space="preserve">Schemat: PostgreSQL wymaga migracji SQL przy każdej zmianie struktury; MongoDB pozwala dodawać nowe pola do dowolnych dokumentów bez migracji.</w:t>
       </w:r>
     </w:p>
     <w:p>
@@ -4371,7 +4374,7 @@
         <w:pStyle w:val="ListBullet"/>
       </w:pPr>
       <w:r>
-        <w:t xml:space="preserve">DEFAULT NOW() → DEFAULT Now()</w:t>
+        <w:t xml:space="preserve">Zapytania: PostgreSQL używa SQL (SELECT, JOIN, GROUP BY); MongoDB używa metod find() i potoku agregacji (aggregate).</w:t>
       </w:r>
     </w:p>
     <w:p>
@@ -4379,7 +4382,7 @@
         <w:pStyle w:val="ListBullet"/>
       </w:pPr>
       <w:r>
-        <w:t xml:space="preserve">Ograniczenia CHECK (np. status IN ('scheduled', 'finished')) nie są wspierane w SQL Access — ustawiane ręcznie przez właściwość Validation Rule w widoku projektu tabeli.</w:t>
+        <w:t xml:space="preserve">Transakcje: PostgreSQL obsługuje ACID natywnie; MongoDB wspiera transakcje od wersji 4.0, ale jest mniej naturalny w tym modelu.</w:t>
       </w:r>
     </w:p>
     <w:p>
@@ -4390,7 +4393,7 @@
         <w:rPr>
           <w:color w:val="E94560"/>
         </w:rPr>
-        <w:t xml:space="preserve">10.1. Kolejność tworzenia tabel</w:t>
+        <w:t xml:space="preserve">10.2. Kolekcje w MongoDB</w:t>
       </w:r>
     </w:p>
     <w:p>
@@ -4398,7 +4401,166 @@
         <w:pStyle w:val="Normal"/>
       </w:pPr>
       <w:r>
-        <w:t xml:space="preserve">Ze względu na klucze obce, tabele muszą być tworzone w kolejności: users, leagues, scoring_rules, następnie teams, matches, a na końcu predictions. Każdą instrukcję CREATE TABLE należy wykonać osobno w edytorze SQL Accessa (Create → Query Design → SQL View → Run).</w:t>
+        <w:t xml:space="preserve">Baza MongoDB o nazwie typer zawiera 6 kolekcji odpowiadających tabelom PostgreSQL: scoring_rules, leagues, teams, users, matches, predictions. Synchronizacja danych odbywa się przez skrypt db/mongo_seed.py, który czyta aktualne dane z PostgreSQL i wgrywa je do MongoDB — zapewnia spójność obu baz bez ręcznego kopiowania.</w:t>
+      </w:r>
+    </w:p>
+    <w:p>
+      <w:pPr>
+        <w:pStyle w:val="Heading2"/>
+      </w:pPr>
+      <w:r>
+        <w:rPr>
+          <w:color w:val="E94560"/>
+        </w:rPr>
+        <w:t xml:space="preserve">10.3. Schemat kolekcji — MongoDB Compass</w:t>
+      </w:r>
+    </w:p>
+    <w:p>
+      <w:pPr>
+        <w:pStyle w:val="Normal"/>
+      </w:pPr>
+      <w:r>
+        <w:t xml:space="preserve">Poniżej schemat kolekcji wygenerowany przez MongoDB Compass (Create → Query Design → Schema → Analyze):</w:t>
+      </w:r>
+    </w:p>
+    <w:p>
+      <w:pPr>
+        <w:pStyle w:val="Normal"/>
+      </w:pPr>
+      <w:r>
+        <w:t xml:space="preserve">[ WKLEJ TUTAJ ZRZUT EKRANU SCHEMATU Z MONGODB COMPASS ]</w:t>
+      </w:r>
+    </w:p>
+    <w:p>
+      <w:pPr>
+        <w:pStyle w:val="Heading1"/>
+      </w:pPr>
+      <w:r>
+        <w:rPr>
+          <w:color w:val="1A1A2E"/>
+        </w:rPr>
+        <w:t xml:space="preserve">10. Odwzorowanie schematu w MongoDB</w:t>
+      </w:r>
+    </w:p>
+    <w:p>
+      <w:pPr>
+        <w:pStyle w:val="Normal"/>
+      </w:pPr>
+      <w:r>
+        <w:t xml:space="preserve">Zgodnie z informacjami dodatkowymi do zadania, baza Access może być zastąpiona przez MongoDB. MongoDB to nierelacyjna baza danych dokumentowa — dane przechowywane są jako dokumenty JSON w kolekcjach zamiast wierszy w tabelach. Schemat jest elastyczny i nie wymaga z góry zdefiniowanych kolumn.</w:t>
+      </w:r>
+    </w:p>
+    <w:p>
+      <w:pPr>
+        <w:pStyle w:val="Heading2"/>
+      </w:pPr>
+      <w:r>
+        <w:rPr>
+          <w:color w:val="E94560"/>
+        </w:rPr>
+        <w:t xml:space="preserve">10.1. Porównanie PostgreSQL i MongoDB</w:t>
+      </w:r>
+    </w:p>
+    <w:p>
+      <w:pPr>
+        <w:pStyle w:val="Normal"/>
+      </w:pPr>
+      <w:r>
+        <w:t xml:space="preserve">Oba systemy przechowują te same dane projektu, ale w różny sposób:</w:t>
+      </w:r>
+    </w:p>
+    <w:p>
+      <w:pPr>
+        <w:pStyle w:val="ListBullet"/>
+      </w:pPr>
+      <w:r>
+        <w:t xml:space="preserve">Struktura: PostgreSQL = tabele + wiersze o stałym schemacie; MongoDB = kolekcje + dokumenty JSON o elastycznej strukturze.</w:t>
+      </w:r>
+    </w:p>
+    <w:p>
+      <w:pPr>
+        <w:pStyle w:val="ListBullet"/>
+      </w:pPr>
+      <w:r>
+        <w:t xml:space="preserve">Relacje: PostgreSQL używa kluczy obcych i operacji JOIN; MongoDB osadza powiązane dane bezpośrednio w dokumencie (embedding) lub trzyma referencje id.</w:t>
+      </w:r>
+    </w:p>
+    <w:p>
+      <w:pPr>
+        <w:pStyle w:val="ListBullet"/>
+      </w:pPr>
+      <w:r>
+        <w:t xml:space="preserve">Przykład: w PostgreSQL mecz przechowuje home_team_id = 7 i wymaga JOIN z tabelą teams. W MongoDB dokument meczu zawiera od razu "home_team": "Bayern München" — bez JOINa.</w:t>
+      </w:r>
+    </w:p>
+    <w:p>
+      <w:pPr>
+        <w:pStyle w:val="ListBullet"/>
+      </w:pPr>
+      <w:r>
+        <w:t xml:space="preserve">Schemat: PostgreSQL wymaga migracji SQL przy każdej zmianie struktury; MongoDB pozwala dodawać nowe pola do dowolnych dokumentów bez migracji.</w:t>
+      </w:r>
+    </w:p>
+    <w:p>
+      <w:pPr>
+        <w:pStyle w:val="ListBullet"/>
+      </w:pPr>
+      <w:r>
+        <w:t xml:space="preserve">Zapytania: PostgreSQL używa SQL (SELECT, JOIN, GROUP BY); MongoDB używa metod find() i potoku agregacji (aggregate).</w:t>
+      </w:r>
+    </w:p>
+    <w:p>
+      <w:pPr>
+        <w:pStyle w:val="ListBullet"/>
+      </w:pPr>
+      <w:r>
+        <w:t xml:space="preserve">Transakcje: PostgreSQL obsługuje ACID natywnie; MongoDB wspiera transakcje od wersji 4.0, ale jest mniej naturalny w tym modelu.</w:t>
+      </w:r>
+    </w:p>
+    <w:p>
+      <w:pPr>
+        <w:pStyle w:val="Heading2"/>
+      </w:pPr>
+      <w:r>
+        <w:rPr>
+          <w:color w:val="E94560"/>
+        </w:rPr>
+        <w:t xml:space="preserve">10.2. Kolekcje w MongoDB</w:t>
+      </w:r>
+    </w:p>
+    <w:p>
+      <w:pPr>
+        <w:pStyle w:val="Normal"/>
+      </w:pPr>
+      <w:r>
+        <w:t xml:space="preserve">Baza MongoDB o nazwie typer zawiera 6 kolekcji odpowiadających tabelom PostgreSQL: scoring_rules, leagues, teams, users, matches, predictions. Synchronizacja danych odbywa się przez skrypt db/mongo_seed.py, który czyta aktualne dane z PostgreSQL i wgrywa je do MongoDB — zapewnia spójność obu baz bez ręcznego kopiowania.</w:t>
+      </w:r>
+    </w:p>
+    <w:p>
+      <w:pPr>
+        <w:pStyle w:val="Heading2"/>
+      </w:pPr>
+      <w:r>
+        <w:rPr>
+          <w:color w:val="E94560"/>
+        </w:rPr>
+        <w:t xml:space="preserve">10.3. Schemat kolekcji — MongoDB Compass</w:t>
+      </w:r>
+    </w:p>
+    <w:p>
+      <w:pPr>
+        <w:pStyle w:val="Normal"/>
+      </w:pPr>
+      <w:r>
+        <w:t xml:space="preserve">Poniżej schemat kolekcji wygenerowany przez MongoDB Compass (Create → Query Design → Schema → Analyze):</w:t>
+      </w:r>
+    </w:p>
+    <w:p>
+      <w:pPr>
+        <w:pStyle w:val="Normal"/>
+      </w:pPr>
+      <w:r>
+        <w:t xml:space="preserve">[ WKLEJ TUTAJ ZRZUT EKRANU SCHEMATU Z MONGODB COMPASS ]</w:t>
       </w:r>
     </w:p>
     <w:p>

</xml_diff>